<commit_message>
Update: replace Pineboards with Geekworm X1012, update full BOM with CCOM links and prices
</commit_message>
<xml_diff>
--- a/RPi5_NVMe_Build_Guide.docx
+++ b/RPi5_NVMe_Build_Guide.docx
@@ -128,7 +128,7 @@
         <w:rPr>
           <w:sz w:val="22"/>
         </w:rPr>
-        <w:t>Unlike the Pi 4, the Pi 5 exposes a PCIe Gen 2 x1 interface via a flat FPC connector. The combined PoE+NVMe HAT (Pineboards HatDrive! PoE+) connects directly to this port via the included 25mm FPC cable, providing full NVMe speed (~900 MB/s read) rather than the USB 3.0 bottleneck of the Pi 4 build.</w:t>
+        <w:t>Unlike the Pi 4, the Pi 5 exposes a PCIe Gen 2 x1 interface via a flat FPC connector. The combined PoE+NVMe HAT (Geekworm X1012) connects directly to this port via the included FPC cable, providing full NVMe speed (~900 MB/s read) rather than the USB 3.0 bottleneck of the Pi 4 build.</w:t>
       </w:r>
     </w:p>
     <w:p>
@@ -147,7 +147,7 @@
         <w:rPr>
           <w:sz w:val="22"/>
         </w:rPr>
-        <w:t>The Raspberry Pi 5 draws more power than the Pi 4. The Pineboards HatDrive! PoE+ supports 802.3at PoE+ (up to 25W), which satisfies the full 5V/5A requirement. Standard 802.3af PoE (15W) is insufficient and may cause instability under load. Confirm your switch ports are PoE+ rated before deployment. A 27W USB-C power supply (Raspberry Pi official or equivalent) is recommended for bench setup.</w:t>
+        <w:t>The Raspberry Pi 5 draws more power than the Pi 4. The Geekworm X1012 supports 802.3at PoE+ (up to 25W), which satisfies the full 5V/5A requirement. Standard 802.3af PoE (15W) is insufficient and may cause instability under load. Confirm your switch ports are PoE+ rated before deployment. A 27W USB-C power supply (Raspberry Pi official or equivalent) is recommended for bench setup.</w:t>
       </w:r>
     </w:p>
     <w:p>
@@ -166,7 +166,7 @@
         <w:rPr>
           <w:sz w:val="22"/>
         </w:rPr>
-        <w:t>The HighPi case listed in the original Pi 4 BOM is not designed for the Pi 5 form factor or a top-mounted combined PoE+NVMe HAT. A Pi 5 compatible case that allows HAT clearance must be selected. Options include open-frame rack mounts, the Argon NEO 5, or cases designed specifically for the Pi 5 with HAT support. Update the BOM before ordering.</w:t>
+        <w:t>The Geekworm P579 Metal Case is confirmed compatible with the Geekworm X1012 HAT. It is a Pi 5 PCIe metal case with HAT clearance. Source: centralcomputer.com ($12.95). Note: the P579 does not have a cutout for the X1012 DC power jack, but this is irrelevant for PoE-powered builds.</w:t>
       </w:r>
     </w:p>
     <w:p>
@@ -204,7 +204,7 @@
         <w:rPr>
           <w:sz w:val="22"/>
         </w:rPr>
-        <w:t>This component is for builds that require HDMI video capture (e.g., ingesting a camera or AV source). If the build does not require video capture, this component can be omitted. The Pineboards HatDrive! PoE+ includes a cut-out for camera/display ribbon access.</w:t>
+        <w:t>This component is for builds that require HDMI video capture (e.g., ingesting a camera or AV source). If the build does not require video capture, this component can be omitted. Verify ribbon cable access with the selected case.</w:t>
       </w:r>
     </w:p>
     <w:p>
@@ -495,7 +495,7 @@
               <w:rPr>
                 <w:sz w:val="18"/>
               </w:rPr>
-              <w:t>TBD</w:t>
+              <w:t>$174.99</w:t>
             </w:r>
           </w:p>
         </w:tc>
@@ -577,9 +577,9 @@
               <w:rPr>
                 <w:sz w:val="18"/>
               </w:rPr>
-              <w:t>Pineboards HatDrive! PoE+ for Raspberry Pi 5</w:t>
+              <w:t>Geekworm X1012 PoE+ HAT and PCIe to M.2 NVMe SSD Shield for Raspberry Pi 5</w:t>
               <w:br/>
-              <w:t>(M.2 M-Key PCIe x1, 802.3at PoE+, 25W, 5V/5A)</w:t>
+              <w:t>(M.2 Key-M PCIe x1, 802.3at PoE+, 25W, 5V/5A; centralcomputer.com)</w:t>
             </w:r>
           </w:p>
         </w:tc>
@@ -619,7 +619,7 @@
               <w:rPr>
                 <w:sz w:val="18"/>
               </w:rPr>
-              <w:t>~$46</w:t>
+              <w:t>$39.95</w:t>
             </w:r>
           </w:p>
         </w:tc>
@@ -639,7 +639,7 @@
               <w:rPr>
                 <w:sz w:val="18"/>
               </w:rPr>
-              <w:t>Replaces separate PoE HAT + USB NVMe adapter; connects via 25mm FPC cable</w:t>
+              <w:t>Replaces separate PoE HAT + USB NVMe adapter; connects via PCIe FPC cable. Source: centralcomputer.com</w:t>
             </w:r>
           </w:p>
         </w:tc>
@@ -701,7 +701,7 @@
               <w:rPr>
                 <w:sz w:val="18"/>
               </w:rPr>
-              <w:t>Pi 5 Compatible Case with HAT Clearance</w:t>
+              <w:t>Geekworm P579 Metal Case for Raspberry Pi 5</w:t>
               <w:br/>
               <w:t>(TBD — see Advisory Note 3)</w:t>
             </w:r>
@@ -743,7 +743,7 @@
               <w:rPr>
                 <w:sz w:val="18"/>
               </w:rPr>
-              <w:t>TBD</w:t>
+              <w:t>$12.95</w:t>
             </w:r>
           </w:p>
         </w:tc>
@@ -763,7 +763,7 @@
               <w:rPr>
                 <w:sz w:val="18"/>
               </w:rPr>
-              <w:t>Must accommodate Pi 5 form factor and top-mounted HAT; select before ordering</w:t>
+              <w:t>Compatible with Geekworm X1012 HAT; Pi 5 PCIe metal case</w:t>
             </w:r>
           </w:p>
         </w:tc>
@@ -825,7 +825,7 @@
               <w:rPr>
                 <w:sz w:val="18"/>
               </w:rPr>
-              <w:t>SanDisk SDSQXH9-128G-GZ6MA (128 GB microSD, U3)</w:t>
+              <w:t>SanDisk SDSQQNR-128G-AN6IA (128 GB High Endurance microSDXC, UHS-I U3)</w:t>
             </w:r>
           </w:p>
         </w:tc>
@@ -865,7 +865,7 @@
               <w:rPr>
                 <w:sz w:val="18"/>
               </w:rPr>
-              <w:t>TBD</w:t>
+              <w:t>$39.99</w:t>
             </w:r>
           </w:p>
         </w:tc>
@@ -949,9 +949,9 @@
               </w:rPr>
               <w:t>M.2 NVMe PCIe SSD, 512 GB – 4 TB</w:t>
               <w:br/>
-              <w:t>(2230, 2242, or 2280 form factor)</w:t>
+              <w:t>(PCIe Gen4 x4, 5150 MB/s read, 4900 MB/s write)</w:t>
               <w:br/>
-              <w:t>(e.g., WD Blue SN580, Samsung 980, Crucial P3 Plus)</w:t>
+              <w:t>(centralcomputer.com)</w:t>
             </w:r>
           </w:p>
         </w:tc>
@@ -991,7 +991,7 @@
               <w:rPr>
                 <w:sz w:val="18"/>
               </w:rPr>
-              <w:t>TBD</w:t>
+              <w:t>$129.99</w:t>
             </w:r>
           </w:p>
         </w:tc>
@@ -1011,7 +1011,7 @@
               <w:rPr>
                 <w:sz w:val="18"/>
               </w:rPr>
-              <w:t>Primary OS and data drive; 2230 or 2242 recommended for compact case builds</w:t>
+              <w:t>Primary OS and data drive; 2230 form factor fits P579 case</w:t>
             </w:r>
           </w:p>
         </w:tc>
@@ -1676,7 +1676,7 @@
         <w:rPr>
           <w:sz w:val="22"/>
         </w:rPr>
-        <w:t>Install the NVMe SSD (M.2 2230/2242/2280) into the M-Key slot on the Pineboards HatDrive! PoE+ HAT. Secure with the provided M.2 standoff and screw.</w:t>
+        <w:t>Install the WD SN770M NVMe SSD (M.2 2230) into the M-Key slot on the Geekworm X1012 HAT. Secure with the provided M.2 standoff and screw.</w:t>
       </w:r>
     </w:p>
     <w:p>
@@ -1712,7 +1712,7 @@
         <w:rPr>
           <w:sz w:val="22"/>
         </w:rPr>
-        <w:t>Seat the HAT's 40-pin GPIO header extension onto the Pi 5's GPIO pins. Press firmly and evenly until fully seated. Secure with the provided metal standoffs.</w:t>
+        <w:t>Seat the Geekworm X1012's 40-pin GPIO header extension onto the Pi 5's GPIO pins. Press firmly and evenly until fully seated. Secure with the provided metal standoffs.</w:t>
       </w:r>
     </w:p>
     <w:p>
@@ -1736,7 +1736,7 @@
         <w:rPr>
           <w:sz w:val="22"/>
         </w:rPr>
-        <w:t>Install the Pi 5 (with HAT attached) into the selected Pi 5 case. Confirm HAT has clearance and all ports are accessible.</w:t>
+        <w:t>Install the Pi 5 (with HAT attached) into the Geekworm P579 Metal Case. Confirm HAT has clearance and all ports are accessible.</w:t>
       </w:r>
     </w:p>
     <w:p>
@@ -2044,7 +2044,7 @@
           <w:b w:val="0"/>
           <w:sz w:val="22"/>
         </w:rPr>
-        <w:t>The Raspberry Pi 5 supports native PCIe NVMe boot. The NVMe drive connected via the Pineboards HatDrive! PoE+ appears as /dev/nvme0n1 — no USB adapter or special boot order workarounds required.</w:t>
+        <w:t>The Raspberry Pi 5 supports native PCIe NVMe boot. The NVMe drive connected via the Geekworm X1012 appears as /dev/nvme0n1 — no USB adapter or special boot order workarounds required.</w:t>
       </w:r>
     </w:p>
     <w:p>
@@ -3640,7 +3640,7 @@
         <w:rPr>
           <w:color w:val="1F4E79"/>
         </w:rPr>
-        <w:t>12. Pineboards HatDrive! PoE+ Verification</w:t>
+        <w:t>12. Geekworm X1012 HAT Verification</w:t>
       </w:r>
     </w:p>
     <w:p>
@@ -4001,7 +4001,7 @@
           <w:i/>
           <w:sz w:val="20"/>
         </w:rPr>
-        <w:t>The Pineboards HatDrive! PoE+ delivers full 5V/5A (25W) to the Pi 5 via 802.3at PoE+. NVMe performance over native PCIe Gen 2 on the Pi 5 is approximately 800–900 MB/s read. The Pi 5 has an onboard active cooler — confirm it is spinning under load. If the unit is unstable, verify the switch port is PoE+ (802.3at) rated, not standard PoE (802.3af).</w:t>
+        <w:t>The Geekworm X1012 delivers full 5V/5A (25W) to the Pi 5 via 802.3at PoE+. NVMe performance over native PCIe Gen 2 on the Pi 5 is approximately 800–900 MB/s read. If the unit is unstable, verify the switch port is PoE+ (802.3at) rated, not standard PoE (802.3af).</w:t>
       </w:r>
     </w:p>
     <w:p/>
@@ -4062,7 +4062,7 @@
         <w:rPr>
           <w:sz w:val="20"/>
         </w:rPr>
-        <w:t>☐  Pineboards HatDrive! PoE+ HAT fully seated on GPIO header, standoffs tight</w:t>
+        <w:t>☐  Geekworm X1012 HAT fully seated on GPIO header, standoffs tight</w:t>
       </w:r>
     </w:p>
     <w:p>

</xml_diff>

<commit_message>
Add Ubiquiti USW-Flex-2.5G-8-PoE as optional BOM item
</commit_message>
<xml_diff>
--- a/RPi5_NVMe_Build_Guide.docx
+++ b/RPi5_NVMe_Build_Guide.docx
@@ -1277,7 +1277,129 @@
               <w:rPr>
                 <w:sz w:val="18"/>
               </w:rPr>
-              <w:t>8</w:t>
+              <w:t>8 (Opt)</w:t>
+            </w:r>
+          </w:p>
+        </w:tc>
+        <w:tc>
+          <w:tcPr>
+            <w:tcW w:type="dxa" w:w="2591"/>
+            <w:shd w:val="clear" w:color="auto" w:fill="FFFFFF"/>
+            <w:tcBorders>
+              <w:top w:val="single" w:sz="4" w:space="0" w:color="CCCCCC"/>
+              <w:left w:val="single" w:sz="4" w:space="0" w:color="CCCCCC"/>
+              <w:bottom w:val="single" w:sz="4" w:space="0" w:color="CCCCCC"/>
+              <w:right w:val="single" w:sz="4" w:space="0" w:color="CCCCCC"/>
+            </w:tcBorders>
+          </w:tcPr>
+          <w:p>
+            <w:r>
+              <w:rPr>
+                <w:sz w:val="18"/>
+              </w:rPr>
+              <w:t>PoE+ Switch (Optional)</w:t>
+            </w:r>
+          </w:p>
+        </w:tc>
+        <w:tc>
+          <w:tcPr>
+            <w:tcW w:type="dxa" w:w="3454"/>
+            <w:shd w:val="clear" w:color="auto" w:fill="FFFFFF"/>
+            <w:tcBorders>
+              <w:top w:val="single" w:sz="4" w:space="0" w:color="CCCCCC"/>
+              <w:left w:val="single" w:sz="4" w:space="0" w:color="CCCCCC"/>
+              <w:bottom w:val="single" w:sz="4" w:space="0" w:color="CCCCCC"/>
+              <w:right w:val="single" w:sz="4" w:space="0" w:color="CCCCCC"/>
+            </w:tcBorders>
+          </w:tcPr>
+          <w:p>
+            <w:r>
+              <w:rPr>
+                <w:sz w:val="18"/>
+              </w:rPr>
+              <w:t>Ubiquiti USW-Flex-2.5G-8-PoE (8-port 802.3at PoE+, 2.5G, 10GbE uplink)</w:t>
+            </w:r>
+          </w:p>
+        </w:tc>
+        <w:tc>
+          <w:tcPr>
+            <w:tcW w:type="dxa" w:w="576"/>
+            <w:shd w:val="clear" w:color="auto" w:fill="FFFFFF"/>
+            <w:tcBorders>
+              <w:top w:val="single" w:sz="4" w:space="0" w:color="CCCCCC"/>
+              <w:left w:val="single" w:sz="4" w:space="0" w:color="CCCCCC"/>
+              <w:bottom w:val="single" w:sz="4" w:space="0" w:color="CCCCCC"/>
+              <w:right w:val="single" w:sz="4" w:space="0" w:color="CCCCCC"/>
+            </w:tcBorders>
+          </w:tcPr>
+          <w:p>
+            <w:r>
+              <w:rPr>
+                <w:sz w:val="18"/>
+              </w:rPr>
+              <w:t>1</w:t>
+            </w:r>
+          </w:p>
+        </w:tc>
+        <w:tc>
+          <w:tcPr>
+            <w:tcW w:type="dxa" w:w="1295"/>
+            <w:shd w:val="clear" w:color="auto" w:fill="FFFFFF"/>
+            <w:tcBorders>
+              <w:top w:val="single" w:sz="4" w:space="0" w:color="CCCCCC"/>
+              <w:left w:val="single" w:sz="4" w:space="0" w:color="CCCCCC"/>
+              <w:bottom w:val="single" w:sz="4" w:space="0" w:color="CCCCCC"/>
+              <w:right w:val="single" w:sz="4" w:space="0" w:color="CCCCCC"/>
+            </w:tcBorders>
+          </w:tcPr>
+          <w:p>
+            <w:r>
+              <w:rPr>
+                <w:sz w:val="18"/>
+              </w:rPr>
+              <w:t>$209.99</w:t>
+            </w:r>
+          </w:p>
+        </w:tc>
+        <w:tc>
+          <w:tcPr>
+            <w:tcW w:type="dxa" w:w="3253"/>
+            <w:shd w:val="clear" w:color="auto" w:fill="FFFFFF"/>
+            <w:tcBorders>
+              <w:top w:val="single" w:sz="4" w:space="0" w:color="CCCCCC"/>
+              <w:left w:val="single" w:sz="4" w:space="0" w:color="CCCCCC"/>
+              <w:bottom w:val="single" w:sz="4" w:space="0" w:color="CCCCCC"/>
+              <w:right w:val="single" w:sz="4" w:space="0" w:color="CCCCCC"/>
+            </w:tcBorders>
+          </w:tcPr>
+          <w:p>
+            <w:r>
+              <w:rPr>
+                <w:sz w:val="18"/>
+              </w:rPr>
+              <w:t>Required only if no existing PoE+ switch is available. centralcomputer.com $209.99</w:t>
+            </w:r>
+          </w:p>
+        </w:tc>
+      </w:tr>
+      <w:tr>
+        <w:tc>
+          <w:tcPr>
+            <w:tcW w:type="dxa" w:w="576"/>
+            <w:shd w:val="clear" w:color="auto" w:fill="FFFFFF"/>
+            <w:tcBorders>
+              <w:top w:val="single" w:sz="4" w:space="0" w:color="CCCCCC"/>
+              <w:left w:val="single" w:sz="4" w:space="0" w:color="CCCCCC"/>
+              <w:bottom w:val="single" w:sz="4" w:space="0" w:color="CCCCCC"/>
+              <w:right w:val="single" w:sz="4" w:space="0" w:color="CCCCCC"/>
+            </w:tcBorders>
+          </w:tcPr>
+          <w:p>
+            <w:r>
+              <w:rPr>
+                <w:sz w:val="18"/>
+              </w:rPr>
+              <w:t>9</w:t>
             </w:r>
           </w:p>
         </w:tc>

</xml_diff>